<commit_message>
Reforca metodologia com precisao terminologica e justificativas de design
- Cross-Encoder: troca "atencao cruzada" por "self-attention conjunta
  sobre o par", distinguindo do mecanismo de cross-attention
  encoder-decoder (auditoria contra o conteudo das aulas do professor)
- Fine-tuning parcial: explicita a razao da taxa de aprendizado menor
  no backbone (mitigar catastrophic forgetting)
- TF-IDF (artigo_sbc.docx): justifica a suavizacao aditiva do IDF
  usada na implementacao, em vez da formula sem suavizacao
- Limitacoes: adiciona nota sobre mean pooling restrito a ultima
  camada do BERTimbau, em vez de agregacoes multi-camada
</commit_message>
<xml_diff>
--- a/docs/Fase3_Metodologia_Conclusao_AgroSele.docx
+++ b/docs/Fase3_Metodologia_Conclusao_AgroSele.docx
@@ -304,7 +304,7 @@
         <w:rPr>
           <w:lang w:val="pt-BR"/>
         </w:rPr>
-        <w:t>Complementarmente à versão com embeddings congelados, foi implementada uma variante com fine-tuning parcial: a última camada do encoder do BERTimbau (1 de 12, ~7% dos parâmetros) e a camada de pooling foram descongeladas e treinadas junto com a cabeça de classificação, com taxa de aprendizado reduzida para os parâmetros do BERTimbau (2×10⁻⁵) em relação à cabeça (1×10⁻³). Diferentemente da versão congelada, essa variante não utiliza cache de embeddings: o texto é recodificado a cada passo de treino, o que eleva substancialmente o custo computacional em CPU.</w:t>
+        <w:t>Complementarmente à versão com embeddings congelados, foi implementada uma variante com fine-tuning parcial: a última camada do encoder do BERTimbau (1 de 12, ~7% dos parâmetros) e a camada de pooling foram descongeladas e treinadas junto com a cabeça de classificação, com taxa de aprendizado reduzida para os parâmetros do BERTimbau (2×10⁻⁵) em relação à cabeça (1×10⁻³) — estratégia de descongelamento parcial que, combinada a uma taxa de aprendizado baixa no backbone, reduz o risco de catastrophic forgetting do conhecimento linguístico pré-treinado. Diferentemente da versão congelada, essa variante não utiliza cache de embeddings: o texto é recodificado a cada passo de treino, o que eleva substancialmente o custo computacional em CPU.</w:t>
       </w:r>
     </w:p>
     <w:p>
@@ -340,7 +340,7 @@
           <w:b w:val="0"/>
           <w:i w:val="0"/>
         </w:rPr>
-        <w:t>Um quinto e um sexto experimento exploraram duas direções adicionais. Primeiro, um Cross-Encoder: em vez de gerar embeddings separados para pergunta e candidata, o BERTimbau processa os dois textos concatenados em uma única sequência (“[CLS] pergunta [SEP] candidata [SEP]”), com atenção cruzada entre eles em todas as camadas; o vetor pooler_output resultante (768 dimensões) já representa o par como um todo, e alimenta uma cabeça de classificação leve, treinada sobre features extraídas com o BERTimbau congelado (perfilamento real: ~362ms por par em CPU, sem possibilidade de cache entre pares diferentes). Segundo, um pipeline multi-estágio que combina os dois experimentos anteriores: o BM25 filtra rapidamente as K candidatas mais promissoras de cada pergunta (estágio barato), e apenas essas passam pelo Cross-Encoder, computacionalmente caro (estágio de reranking), em vez das 50 candidatas completas, reduzindo o número de chamadas ao BERT proporcionalmente a K.</w:t>
+        <w:t>Um quinto e um sexto experimento exploraram duas direções adicionais. Primeiro, um Cross-Encoder: em vez de gerar embeddings separados para pergunta e candidata, o BERTimbau processa os dois textos concatenados em uma única sequência (“[CLS] pergunta [SEP] candidata [SEP]”), cuja self-attention passa a operar conjuntamente sobre ambos os textos em todas as camadas (mecanismo tecnicamente distinto da cross-attention entre encoder e decoder de arquiteturas sequence-to-sequence, já que aqui query, key e value derivam todos da mesma sequência conjunta); o vetor pooler_output resultante (768 dimensões) já representa o par como um todo, e alimenta uma cabeça de classificação leve, treinada sobre features extraídas com o BERTimbau congelado (perfilamento real: ~362ms por par em CPU, sem possibilidade de cache entre pares diferentes). Segundo, um pipeline multi-estágio que combina os dois experimentos anteriores: o BM25 filtra rapidamente as K candidatas mais promissoras de cada pergunta (estágio barato), e apenas essas passam pelo Cross-Encoder, computacionalmente caro (estágio de reranking), em vez das 50 candidatas completas, reduzindo o número de chamadas ao BERT proporcionalmente a K.</w:t>
       </w:r>
     </w:p>
     <w:p>
@@ -898,7 +898,7 @@
           <w:b w:val="0"/>
           <w:i w:val="0"/>
         </w:rPr>
-        <w:t>Um quinto experimento oferece outra perspectiva sobre a mesma questão: o Cross-Encoder, com atenção cruzada entre pergunta e candidata, atinge Accuracy@1 = 0,617 e MRR = 0,715 sem qualquer ajuste de pesos do BERTimbau, superando a versão bi-encoder congelada equivalente (0,570 e 0,679) unicamente pela mudança de arquitetura, mas ainda atrás do híbrido e do fine-tuning. Um sexto experimento combina os achados anteriores em um pipeline de dois estágios (BM25 filtra, Cross-Encoder reranqueia): com K = 10 candidatas reranqueadas, a Accuracy@1 cai apenas de 0,617 para 0,590, uma perda de 0,027, em troca de 80% menos chamadas ao BERT por pergunta, demonstrando que a qualidade do Cross-Encoder pode ser aproximada a uma fração do seu custo computacional original, princípio diretamente aplicável a um cenário de produção com pools de candidatos maiores que os 50 do MilkQA.</w:t>
+        <w:t>Um quinto experimento oferece outra perspectiva sobre a mesma questão: o Cross-Encoder, cuja self-attention opera conjuntamente sobre pergunta e candidata concatenadas, atinge Accuracy@1 = 0,617 e MRR = 0,715 sem qualquer ajuste de pesos do BERTimbau, superando a versão bi-encoder congelada equivalente (0,570 e 0,679) unicamente pela mudança de arquitetura, mas ainda atrás do híbrido e do fine-tuning. Um sexto experimento combina os achados anteriores em um pipeline de dois estágios (BM25 filtra, Cross-Encoder reranqueia): com K = 10 candidatas reranqueadas, a Accuracy@1 cai apenas de 0,617 para 0,590, uma perda de 0,027, em troca de 80% menos chamadas ao BERT por pergunta, demonstrando que a qualidade do Cross-Encoder pode ser aproximada a uma fração do seu custo computacional original, princípio diretamente aplicável a um cenário de produção com pools de candidatos maiores que os 50 do MilkQA.</w:t>
       </w:r>
     </w:p>
     <w:p>
@@ -988,7 +988,7 @@
         <w:rPr>
           <w:lang w:val="pt-BR"/>
         </w:rPr>
-        <w:t>O truncamento de texto em 256 tokens descarta informação de cauda em respostas mais longas (até 682 palavras no dataset). Apenas uma camada do BERTimbau foi descongelada no fine-tuning, por restrição de tempo em CPU sem GPU dedicada; não foi testado se descongelar mais camadas traria ganho adicional. A amostragem de negativos de treino permanece majoritariamente aleatória, e o hard negative mining testado não explorou todo o espaço de configurações possíveis.</w:t>
+        <w:t>O truncamento de texto em 256 tokens descarta informação de cauda em respostas mais longas (até 682 palavras no dataset). A extração de embeddings utilizou mean pooling restrito à última camada oculta do BERTimbau, em vez de agregações multi-camada (por exemplo, a soma das quatro últimas camadas) empregadas em parte da literatura como alternativa potencialmente mais robusta. Apenas uma camada do BERTimbau foi descongelada no fine-tuning, por restrição de tempo em CPU sem GPU dedicada; não foi testado se descongelar mais camadas traria ganho adicional. A amostragem de negativos de treino permanece majoritariamente aleatória, e o hard negative mining testado não explorou todo o espaço de configurações possíveis.</w:t>
       </w:r>
     </w:p>
     <w:p>

</xml_diff>